<commit_message>
docs: made class and components diagrams also made architecture word file
</commit_message>
<xml_diff>
--- a/docs/03-stack.docx
+++ b/docs/03-stack.docx
@@ -5257,11 +5257,6 @@
       </w:r>
     </w:p>
     <w:p>
-      <w:pPr>
-        <w:rPr>
-          <w:lang w:val="ru-RU"/>
-        </w:rPr>
-      </w:pPr>
       <w:r>
         <w:rPr>
           <w:lang w:val="ru-RU"/>
@@ -5277,16 +5272,7 @@
     </w:p>
     <w:p>
       <w:pPr>
-        <w:rPr>
-          <w:lang w:val="ru-RU"/>
-        </w:rPr>
-      </w:pPr>
-    </w:p>
-    <w:p>
-      <w:pPr>
-        <w:rPr>
-          <w:lang w:val="ru-RU"/>
-        </w:rPr>
+        <w:ind w:firstLine="0"/>
       </w:pPr>
     </w:p>
     <w:p>
@@ -5435,15 +5421,7 @@
                 <w:sz w:val="24"/>
                 <w:szCs w:val="24"/>
               </w:rPr>
-              <w:t xml:space="preserve">Free-тариф </w:t>
-            </w:r>
-            <w:r>
-              <w:rPr>
-                <w:sz w:val="24"/>
-                <w:szCs w:val="24"/>
-              </w:rPr>
-              <w:lastRenderedPageBreak/>
-              <w:t>Supabase</w:t>
+              <w:t>Free-тариф Supabase</w:t>
             </w:r>
           </w:p>
         </w:tc>
@@ -5467,16 +5445,7 @@
                 <w:sz w:val="24"/>
                 <w:szCs w:val="24"/>
               </w:rPr>
-              <w:lastRenderedPageBreak/>
-              <w:t xml:space="preserve">Недостаточно места для </w:t>
-            </w:r>
-            <w:r>
-              <w:rPr>
-                <w:sz w:val="24"/>
-                <w:szCs w:val="24"/>
-              </w:rPr>
-              <w:lastRenderedPageBreak/>
-              <w:t>фотографий/БД, трафика или вызовов функций</w:t>
+              <w:t>Недостаточно места для фотографий/БД, трафика или вызовов функций</w:t>
             </w:r>
           </w:p>
         </w:tc>
@@ -5500,16 +5469,7 @@
                 <w:sz w:val="24"/>
                 <w:szCs w:val="24"/>
               </w:rPr>
-              <w:lastRenderedPageBreak/>
-              <w:t xml:space="preserve">Мониторить использование, </w:t>
-            </w:r>
-            <w:r>
-              <w:rPr>
-                <w:sz w:val="24"/>
-                <w:szCs w:val="24"/>
-              </w:rPr>
-              <w:lastRenderedPageBreak/>
-              <w:t>ограничивать размер фото, применять пагинацию и локальный кеш</w:t>
+              <w:t>Мониторить использование, ограничивать размер фото, применять пагинацию и локальный кеш</w:t>
             </w:r>
           </w:p>
         </w:tc>

</xml_diff>